<commit_message>
Add lectures 3-5 and workshops 3-5 from 2025 material
Map last year's (longer) bootcamp into this year's Wed/Thu/Fri:
- lecture_3 (Wed): regularization/elastic net, cross-validation,
  evaluation metrics, SVM
- lecture_4 (Thu): scRNA-seq, trees/forests
- lecture_5 (Fri): batch effects, neural networks
- workshop_3/4/5: regularization examples, ML workshop, India biomarker
  analysis

Decks repointed to the shared ../figs/ background template; figure and
data dependencies copied alongside. All re-rendered (PDF/HTML) except
H2O AutoML (dropped: requires Java; multi-study ML covered by ComBat).

Update README and revised schedule .docx: move regularization to
Wednesday morning and pathway analysis to Tuesday, matching the decks.
Ignore LaTeX render artifacts (*.log/*.aux/*.out).

Co-Authored-By: Claude Opus 4.8 <noreply@anthropic.com>
</commit_message>
<xml_diff>
--- a/SUMMER BOOTCAMP SCHEDULE_2026_REVISED.docx
+++ b/SUMMER BOOTCAMP SCHEDULE_2026_REVISED.docx
@@ -1626,7 +1626,7 @@
                 <w:szCs w:val="24"/>
                 <w:u w:val="none"/>
               </w:rPr>
-              <w:t>Lasso, ridge regression, and Elastic Net; Regularization and variable selection</w:t>
+              <w:t>Pathway enrichment analysis, gene network analysis</w:t>
             </w:r>
           </w:p>
         </w:tc>
@@ -2312,7 +2312,7 @@
                 <w:szCs w:val="24"/>
                 <w:u w:val="none"/>
               </w:rPr>
-              <w:t>Pathway enrichment analysis, gene network analysis</w:t>
+              <w:t>Lasso, ridge regression, and Elastic Net; Regularization and variable selection</w:t>
             </w:r>
           </w:p>
         </w:tc>

</xml_diff>